<commit_message>
Rewrite whole report (title, headings, table) and clean via service
Co-Authored-By: Claude Sonnet 5.5 <noreply@anthropic.com>
Claude-Session: https://claude.ai/code/session_015evKGTTzmhP9UL5Hrmz2vn
</commit_message>
<xml_diff>
--- a/CW4_UrbanStay_Report_rewritten.docx
+++ b/CW4_UrbanStay_Report_rewritten.docx
@@ -20,21 +20,9 @@
           <w:sz w:val="30"/>
           <w:szCs w:val="30"/>
         </w:rPr>
-        <w:t>UrbanStay</w:t>
-      </w:r>
-      <w:proofErr w:type="spellEnd"/>
-      <w:r>
-        <w:rPr>
-          <w:b/>
-          <w:bCs/>
-          <w:sz w:val="30"/>
-          <w:szCs w:val="30"/>
-        </w:rPr>
-        <w:t xml:space="preserve"> Boutique Hotels Ltd: Operational Challenges and Root Causes</w:t>
-      </w:r>
-      <w:r>
-        <w:br w:type="page"/>
-      </w:r>
+        <w:t>UrbanStay Boutique Hotels Ltd: Operational Problems and Their Root Causes</w:t>
+      </w:r>
+      <w:proofErr w:type="spellEnd"/>
     </w:p>
     <w:p>
       <w:pPr>
@@ -75,7 +63,7 @@
         <w:spacing w:after="120"/>
       </w:pPr>
       <w:r>
-        <w:t>AC1: Variation Turns the Front Desk into a Bottleneck</w:t>
+        <w:t>AC1: Variation Turns the Front Desk into a Chokepoint</w:t>
       </w:r>
       <w:r>
         <w:tab/>
@@ -90,7 +78,7 @@
         <w:spacing w:after="120"/>
       </w:pPr>
       <w:r>
-        <w:t>AC2: Root Causes, Recommendations and Comparison</w:t>
+        <w:t>AC2: Causes, Remedies and Competitor Comparison</w:t>
       </w:r>
       <w:r>
         <w:tab/>
@@ -163,7 +151,7 @@
         <w:pStyle w:val="Heading1"/>
       </w:pPr>
       <w:r>
-        <w:t>AC1: Variation Turns the Front Desk into a Bottleneck</w:t>
+        <w:t>AC1: Variation Turns the Front Desk into a Chokepoint</w:t>
       </w:r>
     </w:p>
     <w:p>
@@ -275,7 +263,7 @@
         <w:pStyle w:val="Heading1"/>
       </w:pPr>
       <w:r>
-        <w:t>AC2: Root Causes, Recommendations and Comparison</w:t>
+        <w:t>AC2: Causes, Remedies and Competitor Comparison</w:t>
       </w:r>
     </w:p>
     <w:p>
@@ -311,24 +299,10 @@
           <w:b/>
           <w:bCs/>
         </w:rPr>
-        <w:t xml:space="preserve">Table 1: Evaluation of </w:t>
-      </w:r>
-      <w:proofErr w:type="spellStart"/>
-      <w:r>
-        <w:rPr>
-          <w:b/>
-          <w:bCs/>
-        </w:rPr>
-        <w:t>UrbanStay's</w:t>
-      </w:r>
-      <w:proofErr w:type="spellEnd"/>
-      <w:r>
-        <w:rPr>
-          <w:b/>
-          <w:bCs/>
-        </w:rPr>
-        <w:t xml:space="preserve"> capacity and demand management practices</w:t>
-      </w:r>
+        <w:t>Table 1: Assessment of UrbanStay's capacity and demand management practices</w:t>
+      </w:r>
+      <w:proofErr w:type="spellStart"/>
+      <w:proofErr w:type="spellEnd"/>
     </w:p>
     <w:tbl>
       <w:tblPr>
@@ -475,16 +449,7 @@
                 <w:sz w:val="20"/>
                 <w:szCs w:val="20"/>
               </w:rPr>
-              <w:t>Co</w:t>
-            </w:r>
-            <w:r>
-              <w:rPr>
-                <w:b/>
-                <w:bCs/>
-                <w:sz w:val="20"/>
-                <w:szCs w:val="20"/>
-              </w:rPr>
-              <w:t>nsequence</w:t>
+              <w:t>Consequence</w:t>
             </w:r>
           </w:p>
         </w:tc>
@@ -544,7 +509,7 @@
                 <w:sz w:val="20"/>
                 <w:szCs w:val="20"/>
               </w:rPr>
-              <w:t>Historical averages</w:t>
+              <w:t>Past-average forecasts</w:t>
             </w:r>
           </w:p>
         </w:tc>
@@ -570,7 +535,7 @@
                 <w:sz w:val="20"/>
                 <w:szCs w:val="20"/>
               </w:rPr>
-              <w:t>Ignores variation and events</w:t>
+              <w:t>Overlooks variation and events</w:t>
             </w:r>
           </w:p>
         </w:tc>
@@ -596,7 +561,7 @@
                 <w:sz w:val="20"/>
                 <w:szCs w:val="20"/>
               </w:rPr>
-              <w:t>Missed peaks</w:t>
+              <w:t>Peaks missed</w:t>
             </w:r>
           </w:p>
         </w:tc>
@@ -682,7 +647,7 @@
                 <w:sz w:val="20"/>
                 <w:szCs w:val="20"/>
               </w:rPr>
-              <w:t>Poor fit with volatile demand</w:t>
+              <w:t>Badly matched to volatile demand</w:t>
             </w:r>
           </w:p>
         </w:tc>
@@ -708,16 +673,9 @@
                 <w:sz w:val="20"/>
                 <w:szCs w:val="20"/>
               </w:rPr>
-              <w:t xml:space="preserve">Queues and idle </w:t>
+              <w:t>Queues alongside idle labour</w:t>
             </w:r>
             <w:proofErr w:type="spellStart"/>
-            <w:r>
-              <w:rPr>
-                <w:sz w:val="20"/>
-                <w:szCs w:val="20"/>
-              </w:rPr>
-              <w:t>labour</w:t>
-            </w:r>
             <w:proofErr w:type="spellEnd"/>
           </w:p>
         </w:tc>
@@ -803,7 +761,7 @@
                 <w:sz w:val="20"/>
                 <w:szCs w:val="20"/>
               </w:rPr>
-              <w:t>Low functional flexibility</w:t>
+              <w:t>Little functional flexibility</w:t>
             </w:r>
           </w:p>
         </w:tc>
@@ -829,7 +787,7 @@
                 <w:sz w:val="20"/>
                 <w:szCs w:val="20"/>
               </w:rPr>
-              <w:t>No redeployment</w:t>
+              <w:t>No cross-cover</w:t>
             </w:r>
           </w:p>
         </w:tc>
@@ -863,16 +821,9 @@
                 <w:sz w:val="20"/>
                 <w:szCs w:val="20"/>
               </w:rPr>
-              <w:t xml:space="preserve">Resource </w:t>
+              <w:t>Resource utilisation</w:t>
             </w:r>
             <w:proofErr w:type="spellStart"/>
-            <w:r>
-              <w:rPr>
-                <w:sz w:val="20"/>
-                <w:szCs w:val="20"/>
-              </w:rPr>
-              <w:t>utilisation</w:t>
-            </w:r>
             <w:proofErr w:type="spellEnd"/>
           </w:p>
         </w:tc>
@@ -924,7 +875,7 @@
                 <w:sz w:val="20"/>
                 <w:szCs w:val="20"/>
               </w:rPr>
-              <w:t>Transactions absorb staff time</w:t>
+              <w:t>Transactions consume staff time</w:t>
             </w:r>
           </w:p>
         </w:tc>
@@ -950,7 +901,7 @@
                 <w:sz w:val="20"/>
                 <w:szCs w:val="20"/>
               </w:rPr>
-              <w:t>Desk bottleneck</w:t>
+              <w:t>Desk congestion</w:t>
             </w:r>
           </w:p>
         </w:tc>
@@ -1036,7 +987,7 @@
                 <w:sz w:val="20"/>
                 <w:szCs w:val="20"/>
               </w:rPr>
-              <w:t>Demand not shaped</w:t>
+              <w:t>Demand left unshaped</w:t>
             </w:r>
           </w:p>
         </w:tc>
@@ -1062,7 +1013,7 @@
                 <w:sz w:val="20"/>
                 <w:szCs w:val="20"/>
               </w:rPr>
-              <w:t>Peaks amplified</w:t>
+              <w:t>Peaks magnified</w:t>
             </w:r>
           </w:p>
         </w:tc>
@@ -1079,28 +1030,10 @@
           <w:sz w:val="18"/>
           <w:szCs w:val="18"/>
         </w:rPr>
-        <w:t xml:space="preserve">Source: analysis of the </w:t>
-      </w:r>
-      <w:proofErr w:type="spellStart"/>
-      <w:r>
-        <w:rPr>
-          <w:i/>
-          <w:iCs/>
-          <w:sz w:val="18"/>
-          <w:szCs w:val="18"/>
-        </w:rPr>
-        <w:t>UrbanStay</w:t>
-      </w:r>
-      <w:proofErr w:type="spellEnd"/>
-      <w:r>
-        <w:rPr>
-          <w:i/>
-          <w:iCs/>
-          <w:sz w:val="18"/>
-          <w:szCs w:val="18"/>
-        </w:rPr>
-        <w:t xml:space="preserve"> case.</w:t>
-      </w:r>
+        <w:t>Source: author analysis of UrbanStay's case.</w:t>
+      </w:r>
+      <w:proofErr w:type="spellStart"/>
+      <w:proofErr w:type="spellEnd"/>
     </w:p>
     <w:p>
       <w:pPr>

</xml_diff>